<commit_message>
Update resume: add Canteeno project, fit to single A4 page
</commit_message>
<xml_diff>
--- a/Mohit_Raj_Resume.docx
+++ b/Mohit_Raj_Resume.docx
@@ -4,7 +4,7 @@
   <w:body>
     <w:p>
       <w:pPr>
-        <w:spacing w:after="60"/>
+        <w:spacing w:after="40"/>
         <w:jc w:val="center"/>
       </w:pPr>
       <w:r>
@@ -21,7 +21,7 @@
     </w:p>
     <w:p>
       <w:pPr>
-        <w:spacing w:after="200"/>
+        <w:spacing w:after="40"/>
         <w:jc w:val="center"/>
       </w:pPr>
       <w:r>
@@ -39,7 +39,7 @@
         <w:pBdr>
           <w:bottom w:val="single" w:color="1F3864" w:sz="10" w:space="4"/>
         </w:pBdr>
-        <w:spacing w:after="160"/>
+        <w:spacing w:after="100"/>
         <w:jc w:val="center"/>
       </w:pPr>
       <w:r>
@@ -55,9 +55,9 @@
     <w:p>
       <w:pPr>
         <w:pBdr>
-          <w:bottom w:val="single" w:color="1F3864" w:sz="6" w:space="3"/>
+          <w:bottom w:val="single" w:color="1F3864" w:sz="6" w:space="4"/>
         </w:pBdr>
-        <w:spacing w:after="55" w:before="130"/>
+        <w:spacing w:after="90" w:before="200"/>
       </w:pPr>
       <w:r>
         <w:rPr>
@@ -73,24 +73,24 @@
     </w:p>
     <w:p>
       <w:pPr>
-        <w:spacing w:after="80"/>
-      </w:pPr>
-      <w:r>
-        <w:rPr>
-          <w:rFonts w:ascii="Arial" w:cs="Arial" w:eastAsia="Arial" w:hAnsi="Arial"/>
-          <w:color w:val="222222"/>
-          <w:sz w:val="20"/>
-          <w:szCs w:val="20"/>
-        </w:rPr>
-        <w:t xml:space="preserve">MCA graduate from RV College of Engineering (CGPA 7.90, First Class with Distinction) with hands-on experience across full-stack development, machine learning, and data analytics. Skilled in building end-to-end systems, from ML-driven platforms to full-stack web and mobile applications. Proficient in Java, Python, SQL, React, and Node.js. Seeking an entry-level role in software development, data analytics, or business intelligence.</w:t>
+        <w:spacing w:after="60"/>
+      </w:pPr>
+      <w:r>
+        <w:rPr>
+          <w:rFonts w:ascii="Arial" w:cs="Arial" w:eastAsia="Arial" w:hAnsi="Arial"/>
+          <w:color w:val="222222"/>
+          <w:sz w:val="20"/>
+          <w:szCs w:val="20"/>
+        </w:rPr>
+        <w:t xml:space="preserve">MCA graduate from RV College of Engineering (CGPA 7.90, First Class with Distinction), with hands-on experience across full-stack development, machine learning, and data analytics. I like taking an idea from concept to a working product — from ML-driven platforms to full-stack web and mobile apps. Proficient in Python, SQL, React, and Node.js. Looking for an entry-level role in software development, data analytics, or business intelligence.</w:t>
       </w:r>
     </w:p>
     <w:p>
       <w:pPr>
         <w:pBdr>
-          <w:bottom w:val="single" w:color="1F3864" w:sz="6" w:space="3"/>
+          <w:bottom w:val="single" w:color="1F3864" w:sz="6" w:space="4"/>
         </w:pBdr>
-        <w:spacing w:after="55" w:before="130"/>
+        <w:spacing w:after="90" w:before="200"/>
       </w:pPr>
       <w:r>
         <w:rPr>
@@ -107,9 +107,9 @@
     <w:p>
       <w:pPr>
         <w:tabs>
-          <w:tab w:val="right" w:pos="11320"/>
+          <w:tab w:val="right" w:pos="10986"/>
         </w:tabs>
-        <w:spacing w:after="10" w:before="45"/>
+        <w:spacing w:after="15" w:before="70"/>
       </w:pPr>
       <w:r>
         <w:rPr>
@@ -139,7 +139,7 @@
     </w:p>
     <w:p>
       <w:pPr>
-        <w:spacing w:after="50"/>
+        <w:spacing w:after="70"/>
       </w:pPr>
       <w:r>
         <w:rPr>
@@ -156,9 +156,9 @@
     <w:p>
       <w:pPr>
         <w:tabs>
-          <w:tab w:val="right" w:pos="11320"/>
+          <w:tab w:val="right" w:pos="10986"/>
         </w:tabs>
-        <w:spacing w:after="10" w:before="45"/>
+        <w:spacing w:after="15" w:before="70"/>
       </w:pPr>
       <w:r>
         <w:rPr>
@@ -188,7 +188,7 @@
     </w:p>
     <w:p>
       <w:pPr>
-        <w:spacing w:after="50"/>
+        <w:spacing w:after="70"/>
       </w:pPr>
       <w:r>
         <w:rPr>
@@ -205,9 +205,9 @@
     <w:p>
       <w:pPr>
         <w:pBdr>
-          <w:bottom w:val="single" w:color="1F3864" w:sz="6" w:space="3"/>
+          <w:bottom w:val="single" w:color="1F3864" w:sz="6" w:space="4"/>
         </w:pBdr>
-        <w:spacing w:after="55" w:before="130"/>
+        <w:spacing w:after="90" w:before="200"/>
       </w:pPr>
       <w:r>
         <w:rPr>
@@ -228,45 +228,45 @@
           <w:ilvl w:val="0"/>
           <w:numId w:val="1"/>
         </w:numPr>
-        <w:spacing w:after="30" w:line="246" w:lineRule="auto"/>
-      </w:pPr>
-      <w:r>
-        <w:rPr>
-          <w:rFonts w:ascii="Arial" w:cs="Arial" w:eastAsia="Arial" w:hAnsi="Arial"/>
-          <w:color w:val="222222"/>
-          <w:sz w:val="20"/>
-          <w:szCs w:val="20"/>
-        </w:rPr>
-        <w:t xml:space="preserve">Languages &amp; Web: Java, Python, C, SQL, JavaScript, React, Node.js/Express, MongoDB, Flutter, HTML/CSS, REST APIs</w:t>
-      </w:r>
-    </w:p>
-    <w:p>
-      <w:pPr>
-        <w:pStyle w:val="ListParagraph"/>
-        <w:numPr>
-          <w:ilvl w:val="0"/>
-          <w:numId w:val="1"/>
-        </w:numPr>
-        <w:spacing w:after="30" w:line="246" w:lineRule="auto"/>
-      </w:pPr>
-      <w:r>
-        <w:rPr>
-          <w:rFonts w:ascii="Arial" w:cs="Arial" w:eastAsia="Arial" w:hAnsi="Arial"/>
-          <w:color w:val="222222"/>
-          <w:sz w:val="20"/>
-          <w:szCs w:val="20"/>
-        </w:rPr>
-        <w:t xml:space="preserve">ML/Data: XGBoost, Random Forest, Scikit-learn, TF-IDF, NLP/Sentiment Analysis, Power BI, Tableau, DAX</w:t>
-      </w:r>
-    </w:p>
-    <w:p>
-      <w:pPr>
-        <w:pStyle w:val="ListParagraph"/>
-        <w:numPr>
-          <w:ilvl w:val="0"/>
-          <w:numId w:val="1"/>
-        </w:numPr>
-        <w:spacing w:after="30" w:line="246" w:lineRule="auto"/>
+        <w:spacing w:after="50" w:line="264" w:lineRule="auto"/>
+      </w:pPr>
+      <w:r>
+        <w:rPr>
+          <w:rFonts w:ascii="Arial" w:cs="Arial" w:eastAsia="Arial" w:hAnsi="Arial"/>
+          <w:color w:val="222222"/>
+          <w:sz w:val="20"/>
+          <w:szCs w:val="20"/>
+        </w:rPr>
+        <w:t xml:space="preserve">Languages &amp; Web: Python, C, SQL, JavaScript, React, Node.js/Express, MongoDB, Flutter, HTML/CSS, REST APIs</w:t>
+      </w:r>
+    </w:p>
+    <w:p>
+      <w:pPr>
+        <w:pStyle w:val="ListParagraph"/>
+        <w:numPr>
+          <w:ilvl w:val="0"/>
+          <w:numId w:val="1"/>
+        </w:numPr>
+        <w:spacing w:after="50" w:line="264" w:lineRule="auto"/>
+      </w:pPr>
+      <w:r>
+        <w:rPr>
+          <w:rFonts w:ascii="Arial" w:cs="Arial" w:eastAsia="Arial" w:hAnsi="Arial"/>
+          <w:color w:val="222222"/>
+          <w:sz w:val="20"/>
+          <w:szCs w:val="20"/>
+        </w:rPr>
+        <w:t xml:space="preserve">ML/Data: XGBoost, Random Forest, Scikit-learn, TF-IDF, PyTorch, Transformers (BERT), Power BI, Tableau, DAX</w:t>
+      </w:r>
+    </w:p>
+    <w:p>
+      <w:pPr>
+        <w:pStyle w:val="ListParagraph"/>
+        <w:numPr>
+          <w:ilvl w:val="0"/>
+          <w:numId w:val="1"/>
+        </w:numPr>
+        <w:spacing w:after="50" w:line="264" w:lineRule="auto"/>
       </w:pPr>
       <w:r>
         <w:rPr>
@@ -285,7 +285,7 @@
           <w:ilvl w:val="0"/>
           <w:numId w:val="1"/>
         </w:numPr>
-        <w:spacing w:after="30" w:line="246" w:lineRule="auto"/>
+        <w:spacing w:after="50" w:line="264" w:lineRule="auto"/>
       </w:pPr>
       <w:r>
         <w:rPr>
@@ -300,9 +300,9 @@
     <w:p>
       <w:pPr>
         <w:pBdr>
-          <w:bottom w:val="single" w:color="1F3864" w:sz="6" w:space="3"/>
+          <w:bottom w:val="single" w:color="1F3864" w:sz="6" w:space="4"/>
         </w:pBdr>
-        <w:spacing w:after="55" w:before="130"/>
+        <w:spacing w:after="90" w:before="200"/>
       </w:pPr>
       <w:r>
         <w:rPr>
@@ -319,9 +319,9 @@
     <w:p>
       <w:pPr>
         <w:tabs>
-          <w:tab w:val="right" w:pos="11320"/>
+          <w:tab w:val="right" w:pos="10986"/>
         </w:tabs>
-        <w:spacing w:after="10" w:before="45"/>
+        <w:spacing w:after="15" w:before="70"/>
       </w:pPr>
       <w:r>
         <w:rPr>
@@ -346,13 +346,68 @@
           <w:sz w:val="19"/>
           <w:szCs w:val="19"/>
         </w:rPr>
-        <w:t xml:space="preserve">MCA Major Project (Solo) — Grade A+</w:t>
-      </w:r>
-    </w:p>
-    <w:p>
-      <w:pPr>
-        <w:spacing w:after="10" w:before="0"/>
-      </w:pPr>
+        <w:t xml:space="preserve">github.com/mohitrajjj/CyberShield</w:t>
+      </w:r>
+    </w:p>
+    <w:p>
+      <w:pPr>
+        <w:pStyle w:val="ListParagraph"/>
+        <w:numPr>
+          <w:ilvl w:val="0"/>
+          <w:numId w:val="1"/>
+        </w:numPr>
+        <w:spacing w:after="50" w:line="264" w:lineRule="auto"/>
+      </w:pPr>
+      <w:r>
+        <w:rPr>
+          <w:rFonts w:ascii="Arial" w:cs="Arial" w:eastAsia="Arial" w:hAnsi="Arial"/>
+          <w:color w:val="222222"/>
+          <w:sz w:val="20"/>
+          <w:szCs w:val="20"/>
+        </w:rPr>
+        <w:t xml:space="preserve">MCA Major Project (Solo) — Grade A+. Independently built CyberShield v2.0, an end-to-end threat-intelligence platform (FastAPI/Python, React, SQLite, Docker) combining 4 ML modules: an XGBoost + Random Forest voting classifier for phishing URLs, a TF-IDF + XGBoost model for job-fraud detection, an Error Level Analysis/DCT/FFT pipeline with Grad-CAM for image-manipulation detection, and an Isolation Forest anomaly detector.</w:t>
+      </w:r>
+    </w:p>
+    <w:p>
+      <w:pPr>
+        <w:pStyle w:val="ListParagraph"/>
+        <w:numPr>
+          <w:ilvl w:val="0"/>
+          <w:numId w:val="1"/>
+        </w:numPr>
+        <w:spacing w:after="50" w:line="264" w:lineRule="auto"/>
+      </w:pPr>
+      <w:r>
+        <w:rPr>
+          <w:rFonts w:ascii="Arial" w:cs="Arial" w:eastAsia="Arial" w:hAnsi="Arial"/>
+          <w:color w:val="222222"/>
+          <w:sz w:val="20"/>
+          <w:szCs w:val="20"/>
+        </w:rPr>
+        <w:t xml:space="preserve">Designed a weighted Risk Fusion Engine with LIME/SHAP explainability, batch scanning, and a live performance/history dashboard; achieved 96.4% accuracy (0.993 AUC-ROC) on phishing-URL, 94.2% on job-fraud, and 91.7% on image-forgery detection, with sub-2.1s inference.</w:t>
+      </w:r>
+    </w:p>
+    <w:p>
+      <w:pPr>
+        <w:tabs>
+          <w:tab w:val="right" w:pos="10986"/>
+        </w:tabs>
+        <w:spacing w:after="15" w:before="70"/>
+      </w:pPr>
+      <w:r>
+        <w:rPr>
+          <w:rFonts w:ascii="Arial" w:cs="Arial" w:eastAsia="Arial" w:hAnsi="Arial"/>
+          <w:b/>
+          <w:bCs/>
+          <w:color w:val="222222"/>
+          <w:sz w:val="20"/>
+          <w:szCs w:val="20"/>
+        </w:rPr>
+        <w:t xml:space="preserve">HireSync – Full-Stack Job Application &amp; Recruitment Tracking Platform</w:t>
+      </w:r>
+      <w:r>
+        <w:t xml:space="preserve">	</w:t>
+      </w:r>
       <w:r>
         <w:rPr>
           <w:rFonts w:ascii="Arial" w:cs="Arial" w:eastAsia="Arial" w:hAnsi="Arial"/>
@@ -362,64 +417,45 @@
           <w:sz w:val="19"/>
           <w:szCs w:val="19"/>
         </w:rPr>
-        <w:t xml:space="preserve">github.com/mohitrajjj/AMCDDS-</w:t>
-      </w:r>
-    </w:p>
-    <w:p>
-      <w:pPr>
-        <w:pStyle w:val="ListParagraph"/>
-        <w:numPr>
-          <w:ilvl w:val="0"/>
-          <w:numId w:val="1"/>
-        </w:numPr>
-        <w:spacing w:after="30" w:line="246" w:lineRule="auto"/>
-      </w:pPr>
-      <w:r>
-        <w:rPr>
-          <w:rFonts w:ascii="Arial" w:cs="Arial" w:eastAsia="Arial" w:hAnsi="Arial"/>
-          <w:color w:val="222222"/>
-          <w:sz w:val="20"/>
-          <w:szCs w:val="20"/>
-        </w:rPr>
-        <w:t xml:space="preserve">Independently built CyberShield v2.0, an end-to-end threat-intelligence platform (FastAPI/Python, React, SQLite, Docker) combining 4 ML modules: an XGBoost + Random Forest voting classifier for phishing URLs, a TF-IDF + XGBoost model for job-fraud detection, an Error Level Analysis/DCT/FFT pipeline with Grad-CAM for image-manipulation detection, and an Isolation Forest anomaly detector.</w:t>
-      </w:r>
-    </w:p>
-    <w:p>
-      <w:pPr>
-        <w:pStyle w:val="ListParagraph"/>
-        <w:numPr>
-          <w:ilvl w:val="0"/>
-          <w:numId w:val="1"/>
-        </w:numPr>
-        <w:spacing w:after="30" w:line="246" w:lineRule="auto"/>
-      </w:pPr>
-      <w:r>
-        <w:rPr>
-          <w:rFonts w:ascii="Arial" w:cs="Arial" w:eastAsia="Arial" w:hAnsi="Arial"/>
-          <w:color w:val="222222"/>
-          <w:sz w:val="20"/>
-          <w:szCs w:val="20"/>
-        </w:rPr>
-        <w:t xml:space="preserve">Designed a weighted Risk Fusion Engine with LIME/SHAP explainability, batch scanning, and a live performance/history dashboard; achieved 96.4% accuracy (0.993 AUC-ROC) on phishing-URL, 94.2% on job-fraud, and 91.7% on image-forgery detection, with sub-2.1s inference.</w:t>
+        <w:t xml:space="preserve">github.com/mohitrajjj/HireSync</w:t>
+      </w:r>
+    </w:p>
+    <w:p>
+      <w:pPr>
+        <w:pStyle w:val="ListParagraph"/>
+        <w:numPr>
+          <w:ilvl w:val="0"/>
+          <w:numId w:val="1"/>
+        </w:numPr>
+        <w:spacing w:after="50" w:line="264" w:lineRule="auto"/>
+      </w:pPr>
+      <w:r>
+        <w:rPr>
+          <w:rFonts w:ascii="Arial" w:cs="Arial" w:eastAsia="Arial" w:hAnsi="Arial"/>
+          <w:color w:val="222222"/>
+          <w:sz w:val="20"/>
+          <w:szCs w:val="20"/>
+        </w:rPr>
+        <w:t xml:space="preserve">Developed a MERN-stack platform (React, Node.js/Express, MongoDB) with JWT authentication, job postings, resume upload/storage, and a Recharts analytics dashboard, enabling recruiters to track and filter applicant status in real time instead of manual spreadsheets. Set up CI/CD via GitHub Actions with automated Jest/Vitest test coverage across backend and frontend.</w:t>
       </w:r>
     </w:p>
     <w:p>
       <w:pPr>
         <w:tabs>
-          <w:tab w:val="right" w:pos="11320"/>
+          <w:tab w:val="right" w:pos="10986"/>
         </w:tabs>
-        <w:spacing w:after="10" w:before="45"/>
-      </w:pPr>
-      <w:r>
-        <w:rPr>
-          <w:rFonts w:ascii="Arial" w:cs="Arial" w:eastAsia="Arial" w:hAnsi="Arial"/>
-          <w:b/>
-          <w:bCs/>
-          <w:color w:val="222222"/>
-          <w:sz w:val="20"/>
-          <w:szCs w:val="20"/>
-        </w:rPr>
-        <w:t xml:space="preserve">HireSync – Full-Stack Job Application &amp; Recruitment Tracking Platform</w:t>
+        <w:spacing w:after="15" w:before="70"/>
+      </w:pPr>
+      <w:r>
+        <w:rPr>
+          <w:rFonts w:ascii="Arial" w:cs="Arial" w:eastAsia="Arial" w:hAnsi="Arial"/>
+          <w:b/>
+          <w:bCs/>
+          <w:color w:val="222222"/>
+          <w:sz w:val="20"/>
+          <w:szCs w:val="20"/>
+        </w:rPr>
+        <w:t xml:space="preserve">SpendSense – Personal Finance Tracker (Flutter PWA)</w:t>
       </w:r>
       <w:r>
         <w:t xml:space="preserve">	</w:t>
@@ -433,45 +469,45 @@
           <w:sz w:val="19"/>
           <w:szCs w:val="19"/>
         </w:rPr>
-        <w:t xml:space="preserve">github.com/mohitrajjj/hiresync</w:t>
-      </w:r>
-    </w:p>
-    <w:p>
-      <w:pPr>
-        <w:pStyle w:val="ListParagraph"/>
-        <w:numPr>
-          <w:ilvl w:val="0"/>
-          <w:numId w:val="1"/>
-        </w:numPr>
-        <w:spacing w:after="30" w:line="246" w:lineRule="auto"/>
-      </w:pPr>
-      <w:r>
-        <w:rPr>
-          <w:rFonts w:ascii="Arial" w:cs="Arial" w:eastAsia="Arial" w:hAnsi="Arial"/>
-          <w:color w:val="222222"/>
-          <w:sz w:val="20"/>
-          <w:szCs w:val="20"/>
-        </w:rPr>
-        <w:t xml:space="preserve">Built a MERN-stack platform (React, Node.js/Express, MongoDB) with JWT authentication, job postings, resume upload/storage, and a Recharts analytics dashboard, enabling recruiters to track and filter applicant status in real time instead of manual spreadsheets.</w:t>
+        <w:t xml:space="preserve">github.com/mohitrajjj/SpendSense-flutter</w:t>
+      </w:r>
+    </w:p>
+    <w:p>
+      <w:pPr>
+        <w:pStyle w:val="ListParagraph"/>
+        <w:numPr>
+          <w:ilvl w:val="0"/>
+          <w:numId w:val="1"/>
+        </w:numPr>
+        <w:spacing w:after="50" w:line="264" w:lineRule="auto"/>
+      </w:pPr>
+      <w:r>
+        <w:rPr>
+          <w:rFonts w:ascii="Arial" w:cs="Arial" w:eastAsia="Arial" w:hAnsi="Arial"/>
+          <w:color w:val="222222"/>
+          <w:sz w:val="20"/>
+          <w:szCs w:val="20"/>
+        </w:rPr>
+        <w:t xml:space="preserve">Created a Flutter Progressive Web App for expense tracking with Provider state management, fl_chart analytics, and PDF export, installable with no app-store download and usable offline via local browser storage.</w:t>
       </w:r>
     </w:p>
     <w:p>
       <w:pPr>
         <w:tabs>
-          <w:tab w:val="right" w:pos="11320"/>
+          <w:tab w:val="right" w:pos="10986"/>
         </w:tabs>
-        <w:spacing w:after="10" w:before="45"/>
-      </w:pPr>
-      <w:r>
-        <w:rPr>
-          <w:rFonts w:ascii="Arial" w:cs="Arial" w:eastAsia="Arial" w:hAnsi="Arial"/>
-          <w:b/>
-          <w:bCs/>
-          <w:color w:val="222222"/>
-          <w:sz w:val="20"/>
-          <w:szCs w:val="20"/>
-        </w:rPr>
-        <w:t xml:space="preserve">SpendSense – Personal Finance Tracker (Flutter PWA)</w:t>
+        <w:spacing w:after="15" w:before="70"/>
+      </w:pPr>
+      <w:r>
+        <w:rPr>
+          <w:rFonts w:ascii="Arial" w:cs="Arial" w:eastAsia="Arial" w:hAnsi="Arial"/>
+          <w:b/>
+          <w:bCs/>
+          <w:color w:val="222222"/>
+          <w:sz w:val="20"/>
+          <w:szCs w:val="20"/>
+        </w:rPr>
+        <w:t xml:space="preserve">Canteeno – Canteen Management System (React)</w:t>
       </w:r>
       <w:r>
         <w:t xml:space="preserve">	</w:t>
@@ -485,45 +521,64 @@
           <w:sz w:val="19"/>
           <w:szCs w:val="19"/>
         </w:rPr>
-        <w:t xml:space="preserve">github.com/mohitrajjj/SpendSense-flutter</w:t>
-      </w:r>
-    </w:p>
-    <w:p>
-      <w:pPr>
-        <w:pStyle w:val="ListParagraph"/>
-        <w:numPr>
-          <w:ilvl w:val="0"/>
-          <w:numId w:val="1"/>
-        </w:numPr>
-        <w:spacing w:after="30" w:line="246" w:lineRule="auto"/>
-      </w:pPr>
-      <w:r>
-        <w:rPr>
-          <w:rFonts w:ascii="Arial" w:cs="Arial" w:eastAsia="Arial" w:hAnsi="Arial"/>
-          <w:color w:val="222222"/>
-          <w:sz w:val="20"/>
-          <w:szCs w:val="20"/>
-        </w:rPr>
-        <w:t xml:space="preserve">Built a Flutter Progressive Web App for expense tracking with Provider state management, fl_chart analytics, and PDF export, installable with no app-store download and usable offline via local browser storage.</w:t>
+        <w:t xml:space="preserve">github.com/mohitrajjj/Canteeno</w:t>
+      </w:r>
+    </w:p>
+    <w:p>
+      <w:pPr>
+        <w:pStyle w:val="ListParagraph"/>
+        <w:numPr>
+          <w:ilvl w:val="0"/>
+          <w:numId w:val="1"/>
+        </w:numPr>
+        <w:spacing w:after="50" w:line="264" w:lineRule="auto"/>
+      </w:pPr>
+      <w:r>
+        <w:rPr>
+          <w:rFonts w:ascii="Arial" w:cs="Arial" w:eastAsia="Arial" w:hAnsi="Arial"/>
+          <w:color w:val="222222"/>
+          <w:sz w:val="20"/>
+          <w:szCs w:val="20"/>
+        </w:rPr>
+        <w:t xml:space="preserve">Built a React web app for canteen ordering with a full order-to-wallet flow: employees browse a categorized menu, add items to a cart, and have the total deducted automatically from a wallet balance, with complete order history for both employees and admins. Includes an admin portal for menu/employee management and live stats on orders, revenue, and wallet funds — no backend, fully persisted via localStorage.</w:t>
+      </w:r>
+    </w:p>
+    <w:p>
+      <w:pPr>
+        <w:pBdr>
+          <w:bottom w:val="single" w:color="1F3864" w:sz="6" w:space="4"/>
+        </w:pBdr>
+        <w:spacing w:after="90" w:before="200"/>
+      </w:pPr>
+      <w:r>
+        <w:rPr>
+          <w:rFonts w:ascii="Arial" w:cs="Arial" w:eastAsia="Arial" w:hAnsi="Arial"/>
+          <w:b/>
+          <w:bCs/>
+          <w:color w:val="1F3864"/>
+          <w:sz w:val="22"/>
+          <w:szCs w:val="22"/>
+        </w:rPr>
+        <w:t xml:space="preserve">EXPERIENCE</w:t>
       </w:r>
     </w:p>
     <w:p>
       <w:pPr>
         <w:tabs>
-          <w:tab w:val="right" w:pos="11320"/>
+          <w:tab w:val="right" w:pos="10986"/>
         </w:tabs>
-        <w:spacing w:after="10" w:before="45"/>
-      </w:pPr>
-      <w:r>
-        <w:rPr>
-          <w:rFonts w:ascii="Arial" w:cs="Arial" w:eastAsia="Arial" w:hAnsi="Arial"/>
-          <w:b/>
-          <w:bCs/>
-          <w:color w:val="222222"/>
-          <w:sz w:val="20"/>
-          <w:szCs w:val="20"/>
-        </w:rPr>
-        <w:t xml:space="preserve">FocusSense – Real-Time Focus &amp; Attention Tracking (Minor Project)</w:t>
+        <w:spacing w:after="15" w:before="70"/>
+      </w:pPr>
+      <w:r>
+        <w:rPr>
+          <w:rFonts w:ascii="Arial" w:cs="Arial" w:eastAsia="Arial" w:hAnsi="Arial"/>
+          <w:b/>
+          <w:bCs/>
+          <w:color w:val="222222"/>
+          <w:sz w:val="20"/>
+          <w:szCs w:val="20"/>
+        </w:rPr>
+        <w:t xml:space="preserve">Research Intern — Centre of Competence in Visual Computing, RVCE</w:t>
       </w:r>
       <w:r>
         <w:t xml:space="preserve">	</w:t>
@@ -537,45 +592,45 @@
           <w:sz w:val="19"/>
           <w:szCs w:val="19"/>
         </w:rPr>
-        <w:t xml:space="preserve">github.com/mohitrajjj/Minorproject</w:t>
-      </w:r>
-    </w:p>
-    <w:p>
-      <w:pPr>
-        <w:pStyle w:val="ListParagraph"/>
-        <w:numPr>
-          <w:ilvl w:val="0"/>
-          <w:numId w:val="1"/>
-        </w:numPr>
-        <w:spacing w:after="30" w:line="246" w:lineRule="auto"/>
-      </w:pPr>
-      <w:r>
-        <w:rPr>
-          <w:rFonts w:ascii="Arial" w:cs="Arial" w:eastAsia="Arial" w:hAnsi="Arial"/>
-          <w:color w:val="222222"/>
-          <w:sz w:val="20"/>
-          <w:szCs w:val="20"/>
-        </w:rPr>
-        <w:t xml:space="preserve">Built a real-time focus/attention tracking system using MediaPipe facial-landmark and head-pose analysis feeding a CNN + LSTM classifier, with a Flask dashboard for live multi-student monitoring, SQLite session logging, and CSV/PDF report export.</w:t>
+        <w:t xml:space="preserve">Aug 2025 – Sep 2025 (6 wks)</w:t>
+      </w:r>
+    </w:p>
+    <w:p>
+      <w:pPr>
+        <w:pStyle w:val="ListParagraph"/>
+        <w:numPr>
+          <w:ilvl w:val="0"/>
+          <w:numId w:val="1"/>
+        </w:numPr>
+        <w:spacing w:after="50" w:line="264" w:lineRule="auto"/>
+      </w:pPr>
+      <w:r>
+        <w:rPr>
+          <w:rFonts w:ascii="Arial" w:cs="Arial" w:eastAsia="Arial" w:hAnsi="Arial"/>
+          <w:color w:val="222222"/>
+          <w:sz w:val="20"/>
+          <w:szCs w:val="20"/>
+        </w:rPr>
+        <w:t xml:space="preserve">Built a toxicity detection web app (Flask, PyTorch, HuggingFace Transformers) using a fine-tuned BERT model trained on the Civil Comments dataset to classify text across 6 categories (toxicity, obscene, threat, insult, identity attack, etc.). Added batch analysis with file import, a rate-limited REST API, and rule-based rephrase suggestions with before/after comparison; internship with industry partner Bhargawa Info Tech Solutions. Graded A+.</w:t>
       </w:r>
     </w:p>
     <w:p>
       <w:pPr>
         <w:tabs>
-          <w:tab w:val="right" w:pos="11320"/>
+          <w:tab w:val="right" w:pos="10986"/>
         </w:tabs>
-        <w:spacing w:after="10" w:before="45"/>
-      </w:pPr>
-      <w:r>
-        <w:rPr>
-          <w:rFonts w:ascii="Arial" w:cs="Arial" w:eastAsia="Arial" w:hAnsi="Arial"/>
-          <w:b/>
-          <w:bCs/>
-          <w:color w:val="222222"/>
-          <w:sz w:val="20"/>
-          <w:szCs w:val="20"/>
-        </w:rPr>
-        <w:t xml:space="preserve">Business Intelligence Dashboards – Power BI &amp; Tableau</w:t>
+        <w:spacing w:after="15" w:before="70"/>
+      </w:pPr>
+      <w:r>
+        <w:rPr>
+          <w:rFonts w:ascii="Arial" w:cs="Arial" w:eastAsia="Arial" w:hAnsi="Arial"/>
+          <w:b/>
+          <w:bCs/>
+          <w:color w:val="222222"/>
+          <w:sz w:val="20"/>
+          <w:szCs w:val="20"/>
+        </w:rPr>
+        <w:t xml:space="preserve">Intern — Airobosoft, Bengaluru</w:t>
       </w:r>
       <w:r>
         <w:t xml:space="preserve">	</w:t>
@@ -589,34 +644,34 @@
           <w:sz w:val="19"/>
           <w:szCs w:val="19"/>
         </w:rPr>
-        <w:t xml:space="preserve">RVCE Course Certificate (MCA224B2)</w:t>
-      </w:r>
-    </w:p>
-    <w:p>
-      <w:pPr>
-        <w:pStyle w:val="ListParagraph"/>
-        <w:numPr>
-          <w:ilvl w:val="0"/>
-          <w:numId w:val="1"/>
-        </w:numPr>
-        <w:spacing w:after="30" w:line="246" w:lineRule="auto"/>
-      </w:pPr>
-      <w:r>
-        <w:rPr>
-          <w:rFonts w:ascii="Arial" w:cs="Arial" w:eastAsia="Arial" w:hAnsi="Arial"/>
-          <w:color w:val="222222"/>
-          <w:sz w:val="20"/>
-          <w:szCs w:val="20"/>
-        </w:rPr>
-        <w:t xml:space="preserve">Built Power BI and Tableau dashboards analyzing sales, profitability, regional performance, and customer-level insights as part of MCA coursework.</w:t>
+        <w:t xml:space="preserve">Mar 2024 – Apr 2024</w:t>
+      </w:r>
+    </w:p>
+    <w:p>
+      <w:pPr>
+        <w:pStyle w:val="ListParagraph"/>
+        <w:numPr>
+          <w:ilvl w:val="0"/>
+          <w:numId w:val="1"/>
+        </w:numPr>
+        <w:spacing w:after="50" w:line="264" w:lineRule="auto"/>
+      </w:pPr>
+      <w:r>
+        <w:rPr>
+          <w:rFonts w:ascii="Arial" w:cs="Arial" w:eastAsia="Arial" w:hAnsi="Arial"/>
+          <w:color w:val="222222"/>
+          <w:sz w:val="20"/>
+          <w:szCs w:val="20"/>
+        </w:rPr>
+        <w:t xml:space="preserve">Learned full-stack development fundamentals in a professional team setting; built Meowchi, a full-stack e-commerce website (HTML/CSS/JavaScript, Firebase), as hands-on internship training.</w:t>
       </w:r>
     </w:p>
     <w:p>
       <w:pPr>
         <w:pBdr>
-          <w:bottom w:val="single" w:color="1F3864" w:sz="6" w:space="3"/>
+          <w:bottom w:val="single" w:color="1F3864" w:sz="6" w:space="4"/>
         </w:pBdr>
-        <w:spacing w:after="55" w:before="130"/>
+        <w:spacing w:after="90" w:before="200"/>
       </w:pPr>
       <w:r>
         <w:rPr>
@@ -627,145 +682,6 @@
           <w:sz w:val="22"/>
           <w:szCs w:val="22"/>
         </w:rPr>
-        <w:t xml:space="preserve">EXPERIENCE</w:t>
-      </w:r>
-    </w:p>
-    <w:p>
-      <w:pPr>
-        <w:tabs>
-          <w:tab w:val="right" w:pos="11320"/>
-        </w:tabs>
-        <w:spacing w:after="10" w:before="45"/>
-      </w:pPr>
-      <w:r>
-        <w:rPr>
-          <w:rFonts w:ascii="Arial" w:cs="Arial" w:eastAsia="Arial" w:hAnsi="Arial"/>
-          <w:b/>
-          <w:bCs/>
-          <w:color w:val="222222"/>
-          <w:sz w:val="20"/>
-          <w:szCs w:val="20"/>
-        </w:rPr>
-        <w:t xml:space="preserve">Research Intern — Centre of Competence in Visual Computing, RVCE</w:t>
-      </w:r>
-      <w:r>
-        <w:t xml:space="preserve">	</w:t>
-      </w:r>
-      <w:r>
-        <w:rPr>
-          <w:rFonts w:ascii="Arial" w:cs="Arial" w:eastAsia="Arial" w:hAnsi="Arial"/>
-          <w:i/>
-          <w:iCs/>
-          <w:color w:val="555555"/>
-          <w:sz w:val="19"/>
-          <w:szCs w:val="19"/>
-        </w:rPr>
-        <w:t xml:space="preserve">Aug 2025 – Sep 2025 (6 wks)</w:t>
-      </w:r>
-    </w:p>
-    <w:p>
-      <w:pPr>
-        <w:spacing w:after="10" w:before="0"/>
-      </w:pPr>
-      <w:r>
-        <w:rPr>
-          <w:rFonts w:ascii="Arial" w:cs="Arial" w:eastAsia="Arial" w:hAnsi="Arial"/>
-          <w:i/>
-          <w:iCs/>
-          <w:color w:val="555555"/>
-          <w:sz w:val="19"/>
-          <w:szCs w:val="19"/>
-        </w:rPr>
-        <w:t xml:space="preserve">github.com/mohitrajjj/toxic-app</w:t>
-      </w:r>
-    </w:p>
-    <w:p>
-      <w:pPr>
-        <w:pStyle w:val="ListParagraph"/>
-        <w:numPr>
-          <w:ilvl w:val="0"/>
-          <w:numId w:val="1"/>
-        </w:numPr>
-        <w:spacing w:after="30" w:line="246" w:lineRule="auto"/>
-      </w:pPr>
-      <w:r>
-        <w:rPr>
-          <w:rFonts w:ascii="Arial" w:cs="Arial" w:eastAsia="Arial" w:hAnsi="Arial"/>
-          <w:color w:val="222222"/>
-          <w:sz w:val="20"/>
-          <w:szCs w:val="20"/>
-        </w:rPr>
-        <w:t xml:space="preserve">Built the Toxicity Filter Application, a multilingual (English/Hindi/Hinglish) real-time content-moderation system combining lexicon-based detection, fuzzy string matching, and sentiment polarity scoring (Node.js, Python, Docker) to flag and sanitize harmful text as it's entered, reducing the need for manual moderation review; internship with industry partner Bhargawa Info Tech Solutions. Graded A+.</w:t>
-      </w:r>
-    </w:p>
-    <w:p>
-      <w:pPr>
-        <w:tabs>
-          <w:tab w:val="right" w:pos="11320"/>
-        </w:tabs>
-        <w:spacing w:after="10" w:before="45"/>
-      </w:pPr>
-      <w:r>
-        <w:rPr>
-          <w:rFonts w:ascii="Arial" w:cs="Arial" w:eastAsia="Arial" w:hAnsi="Arial"/>
-          <w:b/>
-          <w:bCs/>
-          <w:color w:val="222222"/>
-          <w:sz w:val="20"/>
-          <w:szCs w:val="20"/>
-        </w:rPr>
-        <w:t xml:space="preserve">Intern — Airobosoft, Bengaluru</w:t>
-      </w:r>
-      <w:r>
-        <w:t xml:space="preserve">	</w:t>
-      </w:r>
-      <w:r>
-        <w:rPr>
-          <w:rFonts w:ascii="Arial" w:cs="Arial" w:eastAsia="Arial" w:hAnsi="Arial"/>
-          <w:i/>
-          <w:iCs/>
-          <w:color w:val="555555"/>
-          <w:sz w:val="19"/>
-          <w:szCs w:val="19"/>
-        </w:rPr>
-        <w:t xml:space="preserve">Mar 2024 – Apr 2024</w:t>
-      </w:r>
-    </w:p>
-    <w:p>
-      <w:pPr>
-        <w:pStyle w:val="ListParagraph"/>
-        <w:numPr>
-          <w:ilvl w:val="0"/>
-          <w:numId w:val="1"/>
-        </w:numPr>
-        <w:spacing w:after="30" w:line="246" w:lineRule="auto"/>
-      </w:pPr>
-      <w:r>
-        <w:rPr>
-          <w:rFonts w:ascii="Arial" w:cs="Arial" w:eastAsia="Arial" w:hAnsi="Arial"/>
-          <w:color w:val="222222"/>
-          <w:sz w:val="20"/>
-          <w:szCs w:val="20"/>
-        </w:rPr>
-        <w:t xml:space="preserve">Contributed to data collection and analysis for an AI &amp; robotics research community as part of the BCA internship program.</w:t>
-      </w:r>
-    </w:p>
-    <w:p>
-      <w:pPr>
-        <w:pBdr>
-          <w:bottom w:val="single" w:color="1F3864" w:sz="6" w:space="3"/>
-        </w:pBdr>
-        <w:spacing w:after="55" w:before="130"/>
-      </w:pPr>
-      <w:r>
-        <w:rPr>
-          <w:rFonts w:ascii="Arial" w:cs="Arial" w:eastAsia="Arial" w:hAnsi="Arial"/>
-          <w:b/>
-          <w:bCs/>
-          <w:color w:val="1F3864"/>
-          <w:sz w:val="22"/>
-          <w:szCs w:val="22"/>
-        </w:rPr>
         <w:t xml:space="preserve">CERTIFICATIONS &amp; ACHIEVEMENTS</w:t>
       </w:r>
     </w:p>
@@ -776,7 +692,7 @@
           <w:ilvl w:val="0"/>
           <w:numId w:val="1"/>
         </w:numPr>
-        <w:spacing w:after="30" w:line="246" w:lineRule="auto"/>
+        <w:spacing w:after="50" w:line="264" w:lineRule="auto"/>
       </w:pPr>
       <w:r>
         <w:rPr>
@@ -795,26 +711,26 @@
           <w:ilvl w:val="0"/>
           <w:numId w:val="1"/>
         </w:numPr>
-        <w:spacing w:after="30" w:line="246" w:lineRule="auto"/>
-      </w:pPr>
-      <w:r>
-        <w:rPr>
-          <w:rFonts w:ascii="Arial" w:cs="Arial" w:eastAsia="Arial" w:hAnsi="Arial"/>
-          <w:color w:val="222222"/>
-          <w:sz w:val="20"/>
-          <w:szCs w:val="20"/>
-        </w:rPr>
-        <w:t xml:space="preserve">PL-300 Exam Preparation Course: Microsoft Power BI Data Analyst — Udemy (Jun 2025)</w:t>
-      </w:r>
-    </w:p>
-    <w:p>
-      <w:pPr>
-        <w:pStyle w:val="ListParagraph"/>
-        <w:numPr>
-          <w:ilvl w:val="0"/>
-          <w:numId w:val="1"/>
-        </w:numPr>
-        <w:spacing w:after="30" w:line="246" w:lineRule="auto"/>
+        <w:spacing w:after="50" w:line="264" w:lineRule="auto"/>
+      </w:pPr>
+      <w:r>
+        <w:rPr>
+          <w:rFonts w:ascii="Arial" w:cs="Arial" w:eastAsia="Arial" w:hAnsi="Arial"/>
+          <w:color w:val="222222"/>
+          <w:sz w:val="20"/>
+          <w:szCs w:val="20"/>
+        </w:rPr>
+        <w:t xml:space="preserve">PL-300 Cert Prep: Microsoft Power BI Data Analyst — Udemy (Jun 2025)</w:t>
+      </w:r>
+    </w:p>
+    <w:p>
+      <w:pPr>
+        <w:pStyle w:val="ListParagraph"/>
+        <w:numPr>
+          <w:ilvl w:val="0"/>
+          <w:numId w:val="1"/>
+        </w:numPr>
+        <w:spacing w:after="50" w:line="264" w:lineRule="auto"/>
       </w:pPr>
       <w:r>
         <w:rPr>
@@ -833,7 +749,7 @@
           <w:ilvl w:val="0"/>
           <w:numId w:val="1"/>
         </w:numPr>
-        <w:spacing w:after="30" w:line="246" w:lineRule="auto"/>
+        <w:spacing w:after="50" w:line="264" w:lineRule="auto"/>
       </w:pPr>
       <w:r>
         <w:rPr>
@@ -846,8 +762,8 @@
       </w:r>
     </w:p>
     <w:sectPr>
-      <w:pgSz w:w="12240" w:h="15840" w:orient="portrait"/>
-      <w:pgMar w:top="140" w:right="460" w:bottom="140" w:left="460" w:header="708" w:footer="708" w:gutter="0"/>
+      <w:pgSz w:w="11906" w:h="16838" w:orient="portrait"/>
+      <w:pgMar w:top="280" w:right="460" w:bottom="280" w:left="460" w:header="708" w:footer="708" w:gutter="0"/>
       <w:pgNumType/>
       <w:docGrid w:linePitch="360"/>
     </w:sectPr>

</xml_diff>

<commit_message>
Fix: resume PDF was still the pre-tightened 2-page version
</commit_message>
<xml_diff>
--- a/Mohit_Raj_Resume.docx
+++ b/Mohit_Raj_Resume.docx
@@ -57,7 +57,7 @@
         <w:pBdr>
           <w:bottom w:val="single" w:color="1F3864" w:sz="6" w:space="4"/>
         </w:pBdr>
-        <w:spacing w:after="90" w:before="200"/>
+        <w:spacing w:after="60" w:before="130"/>
       </w:pPr>
       <w:r>
         <w:rPr>
@@ -90,7 +90,7 @@
         <w:pBdr>
           <w:bottom w:val="single" w:color="1F3864" w:sz="6" w:space="4"/>
         </w:pBdr>
-        <w:spacing w:after="90" w:before="200"/>
+        <w:spacing w:after="60" w:before="130"/>
       </w:pPr>
       <w:r>
         <w:rPr>
@@ -109,7 +109,7 @@
         <w:tabs>
           <w:tab w:val="right" w:pos="10986"/>
         </w:tabs>
-        <w:spacing w:after="15" w:before="70"/>
+        <w:spacing w:after="10" w:before="45"/>
       </w:pPr>
       <w:r>
         <w:rPr>
@@ -158,7 +158,7 @@
         <w:tabs>
           <w:tab w:val="right" w:pos="10986"/>
         </w:tabs>
-        <w:spacing w:after="15" w:before="70"/>
+        <w:spacing w:after="10" w:before="45"/>
       </w:pPr>
       <w:r>
         <w:rPr>
@@ -207,7 +207,7 @@
         <w:pBdr>
           <w:bottom w:val="single" w:color="1F3864" w:sz="6" w:space="4"/>
         </w:pBdr>
-        <w:spacing w:after="90" w:before="200"/>
+        <w:spacing w:after="60" w:before="130"/>
       </w:pPr>
       <w:r>
         <w:rPr>
@@ -228,7 +228,7 @@
           <w:ilvl w:val="0"/>
           <w:numId w:val="1"/>
         </w:numPr>
-        <w:spacing w:after="50" w:line="264" w:lineRule="auto"/>
+        <w:spacing w:after="35" w:line="242" w:lineRule="auto"/>
       </w:pPr>
       <w:r>
         <w:rPr>
@@ -247,7 +247,7 @@
           <w:ilvl w:val="0"/>
           <w:numId w:val="1"/>
         </w:numPr>
-        <w:spacing w:after="50" w:line="264" w:lineRule="auto"/>
+        <w:spacing w:after="35" w:line="242" w:lineRule="auto"/>
       </w:pPr>
       <w:r>
         <w:rPr>
@@ -266,7 +266,7 @@
           <w:ilvl w:val="0"/>
           <w:numId w:val="1"/>
         </w:numPr>
-        <w:spacing w:after="50" w:line="264" w:lineRule="auto"/>
+        <w:spacing w:after="35" w:line="242" w:lineRule="auto"/>
       </w:pPr>
       <w:r>
         <w:rPr>
@@ -285,7 +285,7 @@
           <w:ilvl w:val="0"/>
           <w:numId w:val="1"/>
         </w:numPr>
-        <w:spacing w:after="50" w:line="264" w:lineRule="auto"/>
+        <w:spacing w:after="35" w:line="242" w:lineRule="auto"/>
       </w:pPr>
       <w:r>
         <w:rPr>
@@ -302,7 +302,7 @@
         <w:pBdr>
           <w:bottom w:val="single" w:color="1F3864" w:sz="6" w:space="4"/>
         </w:pBdr>
-        <w:spacing w:after="90" w:before="200"/>
+        <w:spacing w:after="60" w:before="130"/>
       </w:pPr>
       <w:r>
         <w:rPr>
@@ -321,7 +321,7 @@
         <w:tabs>
           <w:tab w:val="right" w:pos="10986"/>
         </w:tabs>
-        <w:spacing w:after="15" w:before="70"/>
+        <w:spacing w:after="10" w:before="45"/>
       </w:pPr>
       <w:r>
         <w:rPr>
@@ -356,7 +356,7 @@
           <w:ilvl w:val="0"/>
           <w:numId w:val="1"/>
         </w:numPr>
-        <w:spacing w:after="50" w:line="264" w:lineRule="auto"/>
+        <w:spacing w:after="35" w:line="242" w:lineRule="auto"/>
       </w:pPr>
       <w:r>
         <w:rPr>
@@ -375,7 +375,7 @@
           <w:ilvl w:val="0"/>
           <w:numId w:val="1"/>
         </w:numPr>
-        <w:spacing w:after="50" w:line="264" w:lineRule="auto"/>
+        <w:spacing w:after="35" w:line="242" w:lineRule="auto"/>
       </w:pPr>
       <w:r>
         <w:rPr>
@@ -392,7 +392,7 @@
         <w:tabs>
           <w:tab w:val="right" w:pos="10986"/>
         </w:tabs>
-        <w:spacing w:after="15" w:before="70"/>
+        <w:spacing w:after="10" w:before="45"/>
       </w:pPr>
       <w:r>
         <w:rPr>
@@ -427,7 +427,7 @@
           <w:ilvl w:val="0"/>
           <w:numId w:val="1"/>
         </w:numPr>
-        <w:spacing w:after="50" w:line="264" w:lineRule="auto"/>
+        <w:spacing w:after="35" w:line="242" w:lineRule="auto"/>
       </w:pPr>
       <w:r>
         <w:rPr>
@@ -444,7 +444,7 @@
         <w:tabs>
           <w:tab w:val="right" w:pos="10986"/>
         </w:tabs>
-        <w:spacing w:after="15" w:before="70"/>
+        <w:spacing w:after="10" w:before="45"/>
       </w:pPr>
       <w:r>
         <w:rPr>
@@ -479,7 +479,7 @@
           <w:ilvl w:val="0"/>
           <w:numId w:val="1"/>
         </w:numPr>
-        <w:spacing w:after="50" w:line="264" w:lineRule="auto"/>
+        <w:spacing w:after="35" w:line="242" w:lineRule="auto"/>
       </w:pPr>
       <w:r>
         <w:rPr>
@@ -496,7 +496,7 @@
         <w:tabs>
           <w:tab w:val="right" w:pos="10986"/>
         </w:tabs>
-        <w:spacing w:after="15" w:before="70"/>
+        <w:spacing w:after="10" w:before="45"/>
       </w:pPr>
       <w:r>
         <w:rPr>
@@ -531,7 +531,7 @@
           <w:ilvl w:val="0"/>
           <w:numId w:val="1"/>
         </w:numPr>
-        <w:spacing w:after="50" w:line="264" w:lineRule="auto"/>
+        <w:spacing w:after="35" w:line="242" w:lineRule="auto"/>
       </w:pPr>
       <w:r>
         <w:rPr>
@@ -548,7 +548,7 @@
         <w:pBdr>
           <w:bottom w:val="single" w:color="1F3864" w:sz="6" w:space="4"/>
         </w:pBdr>
-        <w:spacing w:after="90" w:before="200"/>
+        <w:spacing w:after="60" w:before="130"/>
       </w:pPr>
       <w:r>
         <w:rPr>
@@ -567,7 +567,7 @@
         <w:tabs>
           <w:tab w:val="right" w:pos="10986"/>
         </w:tabs>
-        <w:spacing w:after="15" w:before="70"/>
+        <w:spacing w:after="10" w:before="45"/>
       </w:pPr>
       <w:r>
         <w:rPr>
@@ -602,7 +602,7 @@
           <w:ilvl w:val="0"/>
           <w:numId w:val="1"/>
         </w:numPr>
-        <w:spacing w:after="50" w:line="264" w:lineRule="auto"/>
+        <w:spacing w:after="35" w:line="242" w:lineRule="auto"/>
       </w:pPr>
       <w:r>
         <w:rPr>
@@ -619,7 +619,7 @@
         <w:tabs>
           <w:tab w:val="right" w:pos="10986"/>
         </w:tabs>
-        <w:spacing w:after="15" w:before="70"/>
+        <w:spacing w:after="10" w:before="45"/>
       </w:pPr>
       <w:r>
         <w:rPr>
@@ -654,7 +654,7 @@
           <w:ilvl w:val="0"/>
           <w:numId w:val="1"/>
         </w:numPr>
-        <w:spacing w:after="50" w:line="264" w:lineRule="auto"/>
+        <w:spacing w:after="35" w:line="242" w:lineRule="auto"/>
       </w:pPr>
       <w:r>
         <w:rPr>
@@ -671,7 +671,7 @@
         <w:pBdr>
           <w:bottom w:val="single" w:color="1F3864" w:sz="6" w:space="4"/>
         </w:pBdr>
-        <w:spacing w:after="90" w:before="200"/>
+        <w:spacing w:after="60" w:before="130"/>
       </w:pPr>
       <w:r>
         <w:rPr>
@@ -692,7 +692,7 @@
           <w:ilvl w:val="0"/>
           <w:numId w:val="1"/>
         </w:numPr>
-        <w:spacing w:after="50" w:line="264" w:lineRule="auto"/>
+        <w:spacing w:after="35" w:line="242" w:lineRule="auto"/>
       </w:pPr>
       <w:r>
         <w:rPr>
@@ -711,7 +711,7 @@
           <w:ilvl w:val="0"/>
           <w:numId w:val="1"/>
         </w:numPr>
-        <w:spacing w:after="50" w:line="264" w:lineRule="auto"/>
+        <w:spacing w:after="35" w:line="242" w:lineRule="auto"/>
       </w:pPr>
       <w:r>
         <w:rPr>
@@ -730,7 +730,7 @@
           <w:ilvl w:val="0"/>
           <w:numId w:val="1"/>
         </w:numPr>
-        <w:spacing w:after="50" w:line="264" w:lineRule="auto"/>
+        <w:spacing w:after="35" w:line="242" w:lineRule="auto"/>
       </w:pPr>
       <w:r>
         <w:rPr>
@@ -749,7 +749,7 @@
           <w:ilvl w:val="0"/>
           <w:numId w:val="1"/>
         </w:numPr>
-        <w:spacing w:after="50" w:line="264" w:lineRule="auto"/>
+        <w:spacing w:after="35" w:line="242" w:lineRule="auto"/>
       </w:pPr>
       <w:r>
         <w:rPr>
@@ -763,7 +763,7 @@
     </w:p>
     <w:sectPr>
       <w:pgSz w:w="11906" w:h="16838" w:orient="portrait"/>
-      <w:pgMar w:top="280" w:right="460" w:bottom="280" w:left="460" w:header="708" w:footer="708" w:gutter="0"/>
+      <w:pgMar w:top="220" w:right="460" w:bottom="220" w:left="460" w:header="708" w:footer="708" w:gutter="0"/>
       <w:pgNumType/>
       <w:docGrid w:linePitch="360"/>
     </w:sectPr>

</xml_diff>

<commit_message>
Update resume with latest version
</commit_message>
<xml_diff>
--- a/Mohit_Raj_Resume.docx
+++ b/Mohit_Raj_Resume.docx
@@ -49,15 +49,33 @@
           <w:sz w:val="19"/>
           <w:szCs w:val="19"/>
         </w:rPr>
-        <w:t xml:space="preserve">linkedin.com/in/mohit-rajj   |   github.com/mohitrajjj</w:t>
+        <w:t xml:space="preserve">linkedin.com/in/mohit-rajj</w:t>
+      </w:r>
+      <w:r>
+        <w:rPr>
+          <w:rFonts w:ascii="Arial" w:cs="Arial" w:eastAsia="Arial" w:hAnsi="Arial"/>
+          <w:color w:val="555555"/>
+          <w:sz w:val="19"/>
+          <w:szCs w:val="19"/>
+        </w:rPr>
+        <w:t xml:space="preserve">   |   </w:t>
+      </w:r>
+      <w:r>
+        <w:rPr>
+          <w:rFonts w:ascii="Arial" w:cs="Arial" w:eastAsia="Arial" w:hAnsi="Arial"/>
+          <w:color w:val="555555"/>
+          <w:sz w:val="19"/>
+          <w:szCs w:val="19"/>
+        </w:rPr>
+        <w:t xml:space="preserve">github.com/mohitrajjj</w:t>
       </w:r>
     </w:p>
     <w:p>
       <w:pPr>
         <w:pBdr>
-          <w:bottom w:val="single" w:color="1F3864" w:sz="6" w:space="4"/>
+          <w:bottom w:val="single" w:color="1F3864" w:sz="6" w:space="3"/>
         </w:pBdr>
-        <w:spacing w:after="60" w:before="130"/>
+        <w:spacing w:after="55" w:before="130"/>
       </w:pPr>
       <w:r>
         <w:rPr>
@@ -88,9 +106,9 @@
     <w:p>
       <w:pPr>
         <w:pBdr>
-          <w:bottom w:val="single" w:color="1F3864" w:sz="6" w:space="4"/>
+          <w:bottom w:val="single" w:color="1F3864" w:sz="6" w:space="3"/>
         </w:pBdr>
-        <w:spacing w:after="60" w:before="130"/>
+        <w:spacing w:after="55" w:before="130"/>
       </w:pPr>
       <w:r>
         <w:rPr>
@@ -139,7 +157,7 @@
     </w:p>
     <w:p>
       <w:pPr>
-        <w:spacing w:after="70"/>
+        <w:spacing w:after="50"/>
       </w:pPr>
       <w:r>
         <w:rPr>
@@ -188,7 +206,7 @@
     </w:p>
     <w:p>
       <w:pPr>
-        <w:spacing w:after="70"/>
+        <w:spacing w:after="50"/>
       </w:pPr>
       <w:r>
         <w:rPr>
@@ -205,9 +223,9 @@
     <w:p>
       <w:pPr>
         <w:pBdr>
-          <w:bottom w:val="single" w:color="1F3864" w:sz="6" w:space="4"/>
+          <w:bottom w:val="single" w:color="1F3864" w:sz="6" w:space="3"/>
         </w:pBdr>
-        <w:spacing w:after="60" w:before="130"/>
+        <w:spacing w:after="55" w:before="130"/>
       </w:pPr>
       <w:r>
         <w:rPr>
@@ -228,7 +246,7 @@
           <w:ilvl w:val="0"/>
           <w:numId w:val="1"/>
         </w:numPr>
-        <w:spacing w:after="35" w:line="242" w:lineRule="auto"/>
+        <w:spacing w:after="30" w:line="246" w:lineRule="auto"/>
       </w:pPr>
       <w:r>
         <w:rPr>
@@ -247,7 +265,7 @@
           <w:ilvl w:val="0"/>
           <w:numId w:val="1"/>
         </w:numPr>
-        <w:spacing w:after="35" w:line="242" w:lineRule="auto"/>
+        <w:spacing w:after="30" w:line="246" w:lineRule="auto"/>
       </w:pPr>
       <w:r>
         <w:rPr>
@@ -266,7 +284,7 @@
           <w:ilvl w:val="0"/>
           <w:numId w:val="1"/>
         </w:numPr>
-        <w:spacing w:after="35" w:line="242" w:lineRule="auto"/>
+        <w:spacing w:after="30" w:line="246" w:lineRule="auto"/>
       </w:pPr>
       <w:r>
         <w:rPr>
@@ -285,7 +303,7 @@
           <w:ilvl w:val="0"/>
           <w:numId w:val="1"/>
         </w:numPr>
-        <w:spacing w:after="35" w:line="242" w:lineRule="auto"/>
+        <w:spacing w:after="30" w:line="246" w:lineRule="auto"/>
       </w:pPr>
       <w:r>
         <w:rPr>
@@ -300,9 +318,9 @@
     <w:p>
       <w:pPr>
         <w:pBdr>
-          <w:bottom w:val="single" w:color="1F3864" w:sz="6" w:space="4"/>
+          <w:bottom w:val="single" w:color="1F3864" w:sz="6" w:space="3"/>
         </w:pBdr>
-        <w:spacing w:after="60" w:before="130"/>
+        <w:spacing w:after="55" w:before="130"/>
       </w:pPr>
       <w:r>
         <w:rPr>
@@ -356,7 +374,7 @@
           <w:ilvl w:val="0"/>
           <w:numId w:val="1"/>
         </w:numPr>
-        <w:spacing w:after="35" w:line="242" w:lineRule="auto"/>
+        <w:spacing w:after="30" w:line="246" w:lineRule="auto"/>
       </w:pPr>
       <w:r>
         <w:rPr>
@@ -375,7 +393,7 @@
           <w:ilvl w:val="0"/>
           <w:numId w:val="1"/>
         </w:numPr>
-        <w:spacing w:after="35" w:line="242" w:lineRule="auto"/>
+        <w:spacing w:after="30" w:line="246" w:lineRule="auto"/>
       </w:pPr>
       <w:r>
         <w:rPr>
@@ -427,7 +445,7 @@
           <w:ilvl w:val="0"/>
           <w:numId w:val="1"/>
         </w:numPr>
-        <w:spacing w:after="35" w:line="242" w:lineRule="auto"/>
+        <w:spacing w:after="30" w:line="246" w:lineRule="auto"/>
       </w:pPr>
       <w:r>
         <w:rPr>
@@ -479,7 +497,7 @@
           <w:ilvl w:val="0"/>
           <w:numId w:val="1"/>
         </w:numPr>
-        <w:spacing w:after="35" w:line="242" w:lineRule="auto"/>
+        <w:spacing w:after="30" w:line="246" w:lineRule="auto"/>
       </w:pPr>
       <w:r>
         <w:rPr>
@@ -531,7 +549,7 @@
           <w:ilvl w:val="0"/>
           <w:numId w:val="1"/>
         </w:numPr>
-        <w:spacing w:after="35" w:line="242" w:lineRule="auto"/>
+        <w:spacing w:after="30" w:line="246" w:lineRule="auto"/>
       </w:pPr>
       <w:r>
         <w:rPr>
@@ -546,9 +564,9 @@
     <w:p>
       <w:pPr>
         <w:pBdr>
-          <w:bottom w:val="single" w:color="1F3864" w:sz="6" w:space="4"/>
+          <w:bottom w:val="single" w:color="1F3864" w:sz="6" w:space="3"/>
         </w:pBdr>
-        <w:spacing w:after="60" w:before="130"/>
+        <w:spacing w:after="55" w:before="130"/>
       </w:pPr>
       <w:r>
         <w:rPr>
@@ -602,7 +620,7 @@
           <w:ilvl w:val="0"/>
           <w:numId w:val="1"/>
         </w:numPr>
-        <w:spacing w:after="35" w:line="242" w:lineRule="auto"/>
+        <w:spacing w:after="30" w:line="246" w:lineRule="auto"/>
       </w:pPr>
       <w:r>
         <w:rPr>
@@ -654,7 +672,7 @@
           <w:ilvl w:val="0"/>
           <w:numId w:val="1"/>
         </w:numPr>
-        <w:spacing w:after="35" w:line="242" w:lineRule="auto"/>
+        <w:spacing w:after="30" w:line="246" w:lineRule="auto"/>
       </w:pPr>
       <w:r>
         <w:rPr>
@@ -669,9 +687,9 @@
     <w:p>
       <w:pPr>
         <w:pBdr>
-          <w:bottom w:val="single" w:color="1F3864" w:sz="6" w:space="4"/>
+          <w:bottom w:val="single" w:color="1F3864" w:sz="6" w:space="3"/>
         </w:pBdr>
-        <w:spacing w:after="60" w:before="130"/>
+        <w:spacing w:after="55" w:before="130"/>
       </w:pPr>
       <w:r>
         <w:rPr>
@@ -692,7 +710,7 @@
           <w:ilvl w:val="0"/>
           <w:numId w:val="1"/>
         </w:numPr>
-        <w:spacing w:after="35" w:line="242" w:lineRule="auto"/>
+        <w:spacing w:after="30" w:line="246" w:lineRule="auto"/>
       </w:pPr>
       <w:r>
         <w:rPr>
@@ -711,7 +729,7 @@
           <w:ilvl w:val="0"/>
           <w:numId w:val="1"/>
         </w:numPr>
-        <w:spacing w:after="35" w:line="242" w:lineRule="auto"/>
+        <w:spacing w:after="30" w:line="246" w:lineRule="auto"/>
       </w:pPr>
       <w:r>
         <w:rPr>
@@ -730,7 +748,7 @@
           <w:ilvl w:val="0"/>
           <w:numId w:val="1"/>
         </w:numPr>
-        <w:spacing w:after="35" w:line="242" w:lineRule="auto"/>
+        <w:spacing w:after="30" w:line="246" w:lineRule="auto"/>
       </w:pPr>
       <w:r>
         <w:rPr>
@@ -749,7 +767,7 @@
           <w:ilvl w:val="0"/>
           <w:numId w:val="1"/>
         </w:numPr>
-        <w:spacing w:after="35" w:line="242" w:lineRule="auto"/>
+        <w:spacing w:after="30" w:line="246" w:lineRule="auto"/>
       </w:pPr>
       <w:r>
         <w:rPr>
@@ -763,7 +781,7 @@
     </w:p>
     <w:sectPr>
       <w:pgSz w:w="11906" w:h="16838" w:orient="portrait"/>
-      <w:pgMar w:top="220" w:right="460" w:bottom="220" w:left="460" w:header="708" w:footer="708" w:gutter="0"/>
+      <w:pgMar w:top="140" w:right="460" w:bottom="140" w:left="460" w:header="708" w:footer="708" w:gutter="0"/>
       <w:pgNumType/>
       <w:docGrid w:linePitch="360"/>
     </w:sectPr>

</xml_diff>